<commit_message>
Updated status report: Item #58 resolved, Awards coming soon, SDN timeline request
</commit_message>
<xml_diff>
--- a/SDN_Status_Report_24_March_2026.docx
+++ b/SDN_Status_Report_24_March_2026.docx
@@ -99,12 +99,40 @@
         <w:pStyle w:val="Heading1"/>
       </w:pPr>
       <w:r>
-        <w:t>Collaboration &amp; Progress Since Last Report</w:t>
+        <w:t>Key Developments Today</w:t>
       </w:r>
     </w:p>
     <w:p>
       <w:r>
-        <w:t>Key developments since yesterday:</w:t>
+        <w:t>A productive meeting was held between Brian, Sonja and Nikola today, resulting in several important clarifications and decisions:</w:t>
+      </w:r>
+    </w:p>
+    <w:p>
+      <w:pPr>
+        <w:pStyle w:val="ListBullet"/>
+      </w:pPr>
+      <w:r>
+        <w:rPr>
+          <w:b/>
+        </w:rPr>
+        <w:t xml:space="preserve">Corporate &amp; Academic Membership Flows — Resolved — </w:t>
+      </w:r>
+      <w:r>
+        <w:t>The flows were reviewed in detail during the meeting, and it was confirmed that the current behaviour is working as expected. One additional flow was identified as missing and will be considered as part of Phase 2.</w:t>
+      </w:r>
+    </w:p>
+    <w:p>
+      <w:pPr>
+        <w:pStyle w:val="ListBullet"/>
+      </w:pPr>
+      <w:r>
+        <w:rPr>
+          <w:b/>
+        </w:rPr>
+        <w:t xml:space="preserve">Awards Page — "Coming Soon" for Go Live — </w:t>
+      </w:r>
+      <w:r>
+        <w:t>It was agreed that, for Go Live, the Awards page will display a "Coming soon" state, as further iteration is required and the current content is outdated.</w:t>
       </w:r>
     </w:p>
     <w:p>
@@ -146,21 +174,7 @@
         <w:t xml:space="preserve">Membership — continued strong progress — </w:t>
       </w:r>
       <w:r>
-        <w:t>31 of 56 critical items resolved, with further items being completed today.</w:t>
-      </w:r>
-    </w:p>
-    <w:p>
-      <w:pPr>
-        <w:pStyle w:val="ListBullet"/>
-      </w:pPr>
-      <w:r>
-        <w:rPr>
-          <w:b/>
-        </w:rPr>
-        <w:t xml:space="preserve">Touchpoint, Events &amp; Chapters — </w:t>
-      </w:r>
-      <w:r>
-        <w:t>multiple items resolved across these areas.</w:t>
+        <w:t>multiple additional items completed following today's alignment meeting.</w:t>
       </w:r>
     </w:p>
     <w:p>
@@ -174,7 +188,7 @@
         <w:t xml:space="preserve">Non-critical items — </w:t>
       </w:r>
       <w:r>
-        <w:t>an additional 21 non-critical items resolved since yesterday, demonstrating our continued commitment to platform quality.</w:t>
+        <w:t>an additional 21 non-critical items resolved since yesterday, demonstrating our continued commitment to platform quality beyond go-live requirements.</w:t>
       </w:r>
     </w:p>
     <w:p>
@@ -275,7 +289,7 @@
                 <w:color w:val="FFFFFF"/>
                 <w:sz w:val="19"/>
               </w:rPr>
-              <w:t>Change</w:t>
+              <w:t>Change vs Yesterday</w:t>
             </w:r>
           </w:p>
         </w:tc>
@@ -864,7 +878,7 @@
         <w:t>owned by SDN</w:t>
       </w:r>
       <w:r>
-        <w:t xml:space="preserve"> (content updates, copy changes, pricing decisions) and are awaiting input from the SDN team.</w:t>
+        <w:t xml:space="preserve"> (content updates, copy changes, decisions) and are awaiting input from the SDN team.</w:t>
       </w:r>
     </w:p>
     <w:p>
@@ -1399,6 +1413,202 @@
               <w:rPr>
                 <w:sz w:val="18"/>
               </w:rPr>
+              <w:t>Complete (Coming Soon)</w:t>
+            </w:r>
+          </w:p>
+        </w:tc>
+      </w:tr>
+      <w:tr>
+        <w:tc>
+          <w:tcPr>
+            <w:tcW w:type="dxa" w:w="2268"/>
+          </w:tcPr>
+          <w:p>
+            <w:r/>
+            <w:r>
+              <w:rPr>
+                <w:sz w:val="18"/>
+              </w:rPr>
+              <w:t>About SDN Section</w:t>
+            </w:r>
+          </w:p>
+        </w:tc>
+        <w:tc>
+          <w:tcPr>
+            <w:tcW w:type="dxa" w:w="1417"/>
+          </w:tcPr>
+          <w:p>
+            <w:pPr>
+              <w:jc w:val="center"/>
+            </w:pPr>
+            <w:r/>
+            <w:r>
+              <w:rPr>
+                <w:sz w:val="18"/>
+              </w:rPr>
+              <w:t>3</w:t>
+            </w:r>
+          </w:p>
+        </w:tc>
+        <w:tc>
+          <w:tcPr>
+            <w:tcW w:type="dxa" w:w="1417"/>
+          </w:tcPr>
+          <w:p>
+            <w:pPr>
+              <w:jc w:val="center"/>
+            </w:pPr>
+            <w:r/>
+            <w:r>
+              <w:rPr>
+                <w:sz w:val="18"/>
+              </w:rPr>
+              <w:t>3</w:t>
+            </w:r>
+          </w:p>
+        </w:tc>
+        <w:tc>
+          <w:tcPr>
+            <w:tcW w:type="dxa" w:w="1417"/>
+          </w:tcPr>
+          <w:p>
+            <w:pPr>
+              <w:jc w:val="center"/>
+            </w:pPr>
+            <w:r/>
+            <w:r>
+              <w:rPr>
+                <w:sz w:val="18"/>
+              </w:rPr>
+              <w:t>0</w:t>
+            </w:r>
+          </w:p>
+        </w:tc>
+        <w:tc>
+          <w:tcPr>
+            <w:tcW w:type="dxa" w:w="1701"/>
+          </w:tcPr>
+          <w:p>
+            <w:pPr>
+              <w:jc w:val="center"/>
+            </w:pPr>
+            <w:r/>
+            <w:r>
+              <w:rPr>
+                <w:sz w:val="18"/>
+              </w:rPr>
+              <w:t>5</w:t>
+            </w:r>
+          </w:p>
+        </w:tc>
+        <w:tc>
+          <w:tcPr>
+            <w:tcW w:type="dxa" w:w="1984"/>
+          </w:tcPr>
+          <w:p>
+            <w:r/>
+            <w:r>
+              <w:rPr>
+                <w:sz w:val="18"/>
+              </w:rPr>
+              <w:t>Complete</w:t>
+            </w:r>
+          </w:p>
+        </w:tc>
+      </w:tr>
+      <w:tr>
+        <w:tc>
+          <w:tcPr>
+            <w:tcW w:type="dxa" w:w="2268"/>
+          </w:tcPr>
+          <w:p>
+            <w:r/>
+            <w:r>
+              <w:rPr>
+                <w:sz w:val="18"/>
+              </w:rPr>
+              <w:t>Case Studies</w:t>
+            </w:r>
+          </w:p>
+        </w:tc>
+        <w:tc>
+          <w:tcPr>
+            <w:tcW w:type="dxa" w:w="1417"/>
+          </w:tcPr>
+          <w:p>
+            <w:pPr>
+              <w:jc w:val="center"/>
+            </w:pPr>
+            <w:r/>
+            <w:r>
+              <w:rPr>
+                <w:sz w:val="18"/>
+              </w:rPr>
+              <w:t>2</w:t>
+            </w:r>
+          </w:p>
+        </w:tc>
+        <w:tc>
+          <w:tcPr>
+            <w:tcW w:type="dxa" w:w="1417"/>
+          </w:tcPr>
+          <w:p>
+            <w:pPr>
+              <w:jc w:val="center"/>
+            </w:pPr>
+            <w:r/>
+            <w:r>
+              <w:rPr>
+                <w:sz w:val="18"/>
+              </w:rPr>
+              <w:t>2</w:t>
+            </w:r>
+          </w:p>
+        </w:tc>
+        <w:tc>
+          <w:tcPr>
+            <w:tcW w:type="dxa" w:w="1417"/>
+          </w:tcPr>
+          <w:p>
+            <w:pPr>
+              <w:jc w:val="center"/>
+            </w:pPr>
+            <w:r/>
+            <w:r>
+              <w:rPr>
+                <w:sz w:val="18"/>
+              </w:rPr>
+              <w:t>0</w:t>
+            </w:r>
+          </w:p>
+        </w:tc>
+        <w:tc>
+          <w:tcPr>
+            <w:tcW w:type="dxa" w:w="1701"/>
+          </w:tcPr>
+          <w:p>
+            <w:pPr>
+              <w:jc w:val="center"/>
+            </w:pPr>
+            <w:r/>
+            <w:r>
+              <w:rPr>
+                <w:sz w:val="18"/>
+              </w:rPr>
+              <w:t>4</w:t>
+            </w:r>
+          </w:p>
+        </w:tc>
+        <w:tc>
+          <w:tcPr>
+            <w:tcW w:type="dxa" w:w="1984"/>
+          </w:tcPr>
+          <w:p>
+            <w:r/>
+            <w:r>
+              <w:rPr>
+                <w:sz w:val="18"/>
+              </w:rPr>
               <w:t>Complete</w:t>
             </w:r>
           </w:p>
@@ -1709,6 +1919,104 @@
               <w:rPr>
                 <w:sz w:val="18"/>
               </w:rPr>
+              <w:t>Events &amp; News</w:t>
+            </w:r>
+          </w:p>
+        </w:tc>
+        <w:tc>
+          <w:tcPr>
+            <w:tcW w:type="dxa" w:w="1417"/>
+          </w:tcPr>
+          <w:p>
+            <w:pPr>
+              <w:jc w:val="center"/>
+            </w:pPr>
+            <w:r/>
+            <w:r>
+              <w:rPr>
+                <w:sz w:val="18"/>
+              </w:rPr>
+              <w:t>6</w:t>
+            </w:r>
+          </w:p>
+        </w:tc>
+        <w:tc>
+          <w:tcPr>
+            <w:tcW w:type="dxa" w:w="1417"/>
+          </w:tcPr>
+          <w:p>
+            <w:pPr>
+              <w:jc w:val="center"/>
+            </w:pPr>
+            <w:r/>
+            <w:r>
+              <w:rPr>
+                <w:sz w:val="18"/>
+              </w:rPr>
+              <w:t>5</w:t>
+            </w:r>
+          </w:p>
+        </w:tc>
+        <w:tc>
+          <w:tcPr>
+            <w:tcW w:type="dxa" w:w="1417"/>
+          </w:tcPr>
+          <w:p>
+            <w:pPr>
+              <w:jc w:val="center"/>
+            </w:pPr>
+            <w:r/>
+            <w:r>
+              <w:rPr>
+                <w:sz w:val="18"/>
+              </w:rPr>
+              <w:t>1</w:t>
+            </w:r>
+          </w:p>
+        </w:tc>
+        <w:tc>
+          <w:tcPr>
+            <w:tcW w:type="dxa" w:w="1701"/>
+          </w:tcPr>
+          <w:p>
+            <w:pPr>
+              <w:jc w:val="center"/>
+            </w:pPr>
+            <w:r/>
+            <w:r>
+              <w:rPr>
+                <w:sz w:val="18"/>
+              </w:rPr>
+              <w:t>6</w:t>
+            </w:r>
+          </w:p>
+        </w:tc>
+        <w:tc>
+          <w:tcPr>
+            <w:tcW w:type="dxa" w:w="1984"/>
+          </w:tcPr>
+          <w:p>
+            <w:r/>
+            <w:r>
+              <w:rPr>
+                <w:sz w:val="18"/>
+              </w:rPr>
+              <w:t>Nearly complete</w:t>
+            </w:r>
+          </w:p>
+        </w:tc>
+      </w:tr>
+      <w:tr>
+        <w:tc>
+          <w:tcPr>
+            <w:tcW w:type="dxa" w:w="2268"/>
+          </w:tcPr>
+          <w:p>
+            <w:r/>
+            <w:r>
+              <w:rPr>
+                <w:sz w:val="18"/>
+              </w:rPr>
               <w:t>Chapters</w:t>
             </w:r>
           </w:p>
@@ -1905,104 +2213,6 @@
               <w:rPr>
                 <w:sz w:val="18"/>
               </w:rPr>
-              <w:t>Events &amp; News</w:t>
-            </w:r>
-          </w:p>
-        </w:tc>
-        <w:tc>
-          <w:tcPr>
-            <w:tcW w:type="dxa" w:w="1417"/>
-          </w:tcPr>
-          <w:p>
-            <w:pPr>
-              <w:jc w:val="center"/>
-            </w:pPr>
-            <w:r/>
-            <w:r>
-              <w:rPr>
-                <w:sz w:val="18"/>
-              </w:rPr>
-              <w:t>6</w:t>
-            </w:r>
-          </w:p>
-        </w:tc>
-        <w:tc>
-          <w:tcPr>
-            <w:tcW w:type="dxa" w:w="1417"/>
-          </w:tcPr>
-          <w:p>
-            <w:pPr>
-              <w:jc w:val="center"/>
-            </w:pPr>
-            <w:r/>
-            <w:r>
-              <w:rPr>
-                <w:sz w:val="18"/>
-              </w:rPr>
-              <w:t>5</w:t>
-            </w:r>
-          </w:p>
-        </w:tc>
-        <w:tc>
-          <w:tcPr>
-            <w:tcW w:type="dxa" w:w="1417"/>
-          </w:tcPr>
-          <w:p>
-            <w:pPr>
-              <w:jc w:val="center"/>
-            </w:pPr>
-            <w:r/>
-            <w:r>
-              <w:rPr>
-                <w:sz w:val="18"/>
-              </w:rPr>
-              <w:t>1</w:t>
-            </w:r>
-          </w:p>
-        </w:tc>
-        <w:tc>
-          <w:tcPr>
-            <w:tcW w:type="dxa" w:w="1701"/>
-          </w:tcPr>
-          <w:p>
-            <w:pPr>
-              <w:jc w:val="center"/>
-            </w:pPr>
-            <w:r/>
-            <w:r>
-              <w:rPr>
-                <w:sz w:val="18"/>
-              </w:rPr>
-              <w:t>6</w:t>
-            </w:r>
-          </w:p>
-        </w:tc>
-        <w:tc>
-          <w:tcPr>
-            <w:tcW w:type="dxa" w:w="1984"/>
-          </w:tcPr>
-          <w:p>
-            <w:r/>
-            <w:r>
-              <w:rPr>
-                <w:sz w:val="18"/>
-              </w:rPr>
-              <w:t>Nearly complete</w:t>
-            </w:r>
-          </w:p>
-        </w:tc>
-      </w:tr>
-      <w:tr>
-        <w:tc>
-          <w:tcPr>
-            <w:tcW w:type="dxa" w:w="2268"/>
-          </w:tcPr>
-          <w:p>
-            <w:r/>
-            <w:r>
-              <w:rPr>
-                <w:sz w:val="18"/>
-              </w:rPr>
               <w:t>Touchpoint</w:t>
             </w:r>
           </w:p>
@@ -2086,202 +2296,6 @@
                 <w:sz w:val="18"/>
               </w:rPr>
               <w:t>In progress</w:t>
-            </w:r>
-          </w:p>
-        </w:tc>
-      </w:tr>
-      <w:tr>
-        <w:tc>
-          <w:tcPr>
-            <w:tcW w:type="dxa" w:w="2268"/>
-          </w:tcPr>
-          <w:p>
-            <w:r/>
-            <w:r>
-              <w:rPr>
-                <w:sz w:val="18"/>
-              </w:rPr>
-              <w:t>About SDN Section</w:t>
-            </w:r>
-          </w:p>
-        </w:tc>
-        <w:tc>
-          <w:tcPr>
-            <w:tcW w:type="dxa" w:w="1417"/>
-          </w:tcPr>
-          <w:p>
-            <w:pPr>
-              <w:jc w:val="center"/>
-            </w:pPr>
-            <w:r/>
-            <w:r>
-              <w:rPr>
-                <w:sz w:val="18"/>
-              </w:rPr>
-              <w:t>3</w:t>
-            </w:r>
-          </w:p>
-        </w:tc>
-        <w:tc>
-          <w:tcPr>
-            <w:tcW w:type="dxa" w:w="1417"/>
-          </w:tcPr>
-          <w:p>
-            <w:pPr>
-              <w:jc w:val="center"/>
-            </w:pPr>
-            <w:r/>
-            <w:r>
-              <w:rPr>
-                <w:sz w:val="18"/>
-              </w:rPr>
-              <w:t>3</w:t>
-            </w:r>
-          </w:p>
-        </w:tc>
-        <w:tc>
-          <w:tcPr>
-            <w:tcW w:type="dxa" w:w="1417"/>
-          </w:tcPr>
-          <w:p>
-            <w:pPr>
-              <w:jc w:val="center"/>
-            </w:pPr>
-            <w:r/>
-            <w:r>
-              <w:rPr>
-                <w:sz w:val="18"/>
-              </w:rPr>
-              <w:t>0</w:t>
-            </w:r>
-          </w:p>
-        </w:tc>
-        <w:tc>
-          <w:tcPr>
-            <w:tcW w:type="dxa" w:w="1701"/>
-          </w:tcPr>
-          <w:p>
-            <w:pPr>
-              <w:jc w:val="center"/>
-            </w:pPr>
-            <w:r/>
-            <w:r>
-              <w:rPr>
-                <w:sz w:val="18"/>
-              </w:rPr>
-              <w:t>5</w:t>
-            </w:r>
-          </w:p>
-        </w:tc>
-        <w:tc>
-          <w:tcPr>
-            <w:tcW w:type="dxa" w:w="1984"/>
-          </w:tcPr>
-          <w:p>
-            <w:r/>
-            <w:r>
-              <w:rPr>
-                <w:sz w:val="18"/>
-              </w:rPr>
-              <w:t>Complete</w:t>
-            </w:r>
-          </w:p>
-        </w:tc>
-      </w:tr>
-      <w:tr>
-        <w:tc>
-          <w:tcPr>
-            <w:tcW w:type="dxa" w:w="2268"/>
-          </w:tcPr>
-          <w:p>
-            <w:r/>
-            <w:r>
-              <w:rPr>
-                <w:sz w:val="18"/>
-              </w:rPr>
-              <w:t>Case Studies</w:t>
-            </w:r>
-          </w:p>
-        </w:tc>
-        <w:tc>
-          <w:tcPr>
-            <w:tcW w:type="dxa" w:w="1417"/>
-          </w:tcPr>
-          <w:p>
-            <w:pPr>
-              <w:jc w:val="center"/>
-            </w:pPr>
-            <w:r/>
-            <w:r>
-              <w:rPr>
-                <w:sz w:val="18"/>
-              </w:rPr>
-              <w:t>2</w:t>
-            </w:r>
-          </w:p>
-        </w:tc>
-        <w:tc>
-          <w:tcPr>
-            <w:tcW w:type="dxa" w:w="1417"/>
-          </w:tcPr>
-          <w:p>
-            <w:pPr>
-              <w:jc w:val="center"/>
-            </w:pPr>
-            <w:r/>
-            <w:r>
-              <w:rPr>
-                <w:sz w:val="18"/>
-              </w:rPr>
-              <w:t>2</w:t>
-            </w:r>
-          </w:p>
-        </w:tc>
-        <w:tc>
-          <w:tcPr>
-            <w:tcW w:type="dxa" w:w="1417"/>
-          </w:tcPr>
-          <w:p>
-            <w:pPr>
-              <w:jc w:val="center"/>
-            </w:pPr>
-            <w:r/>
-            <w:r>
-              <w:rPr>
-                <w:sz w:val="18"/>
-              </w:rPr>
-              <w:t>0</w:t>
-            </w:r>
-          </w:p>
-        </w:tc>
-        <w:tc>
-          <w:tcPr>
-            <w:tcW w:type="dxa" w:w="1701"/>
-          </w:tcPr>
-          <w:p>
-            <w:pPr>
-              <w:jc w:val="center"/>
-            </w:pPr>
-            <w:r/>
-            <w:r>
-              <w:rPr>
-                <w:sz w:val="18"/>
-              </w:rPr>
-              <w:t>4</w:t>
-            </w:r>
-          </w:p>
-        </w:tc>
-        <w:tc>
-          <w:tcPr>
-            <w:tcW w:type="dxa" w:w="1984"/>
-          </w:tcPr>
-          <w:p>
-            <w:r/>
-            <w:r>
-              <w:rPr>
-                <w:sz w:val="18"/>
-              </w:rPr>
-              <w:t>Complete</w:t>
             </w:r>
           </w:p>
         </w:tc>
@@ -2423,49 +2437,54 @@
         <w:pStyle w:val="Heading1"/>
       </w:pPr>
       <w:r>
-        <w:t>Important Notice — Corporate &amp; Academic Membership Flow</w:t>
+        <w:t>Corporate &amp; Academic Membership Flow — Resolved</w:t>
       </w:r>
     </w:p>
     <w:p>
       <w:r>
-        <w:rPr>
-          <w:b/>
-        </w:rPr>
-        <w:t>Item #58 — Corporate &amp; Academic Members: New Registration Flow</w:t>
-      </w:r>
-    </w:p>
-    <w:p>
-      <w:r>
-        <w:t xml:space="preserve">As communicated in our previous report, this item proposes a fundamental architectural change to the membership registration pipeline. </w:t>
+        <w:t xml:space="preserve">Following today's meeting between Brian, Sonja and Nikola, the Corporate and Academic membership flows were reviewed in detail. </w:t>
       </w:r>
       <w:r>
         <w:rPr>
           <w:b/>
         </w:rPr>
-        <w:t>Our position remains unchanged: this must not be included in the go-live scope.</w:t>
+        <w:t>It was confirmed that the current behaviour is working as expected.</w:t>
       </w:r>
     </w:p>
     <w:p>
       <w:r>
-        <w:t xml:space="preserve">Including this change would delay launch by an estimated </w:t>
+        <w:t xml:space="preserve">One additional flow was identified as missing during the review. As agreed in the meeting, this will be </w:t>
       </w:r>
       <w:r>
         <w:rPr>
           <w:b/>
         </w:rPr>
-        <w:t>6+ weeks</w:t>
+        <w:t>addressed in Phase 2</w:t>
       </w:r>
       <w:r>
-        <w:t xml:space="preserve"> (3–4 weeks development + 2–3 weeks testing). Our strong recommendation is to proceed with the current implementation and schedule this as a </w:t>
+        <w:t xml:space="preserve"> — it does not impact Go Live readiness.</w:t>
+      </w:r>
+    </w:p>
+    <w:p>
+      <w:pPr>
+        <w:pStyle w:val="Heading1"/>
+      </w:pPr>
+      <w:r>
+        <w:t>Awards Page — "Coming Soon" for Go Live</w:t>
+      </w:r>
+    </w:p>
+    <w:p>
+      <w:r>
+        <w:t xml:space="preserve">It was agreed during today's meeting that the Awards page will display a </w:t>
       </w:r>
       <w:r>
         <w:rPr>
           <w:b/>
         </w:rPr>
-        <w:t>Phase 2 priority item</w:t>
+        <w:t>"Coming soon"</w:t>
       </w:r>
       <w:r>
-        <w:t>.</w:t>
+        <w:t xml:space="preserve"> state for Go Live. The current content is outdated and requires further iteration, which will be addressed post-launch. This decision ensures the page does not present inaccurate information to users while allowing the team to focus on higher-priority items.</w:t>
       </w:r>
     </w:p>
     <w:p>
@@ -2497,23 +2516,33 @@
         <w:t xml:space="preserve">Current target: </w:t>
       </w:r>
       <w:r>
-        <w:t xml:space="preserve">Appolica is on track to complete all items assigned to our team </w:t>
+        <w:t xml:space="preserve">As noted in yesterday's update, our goal remains to </w:t>
       </w:r>
       <w:r>
         <w:rPr>
           <w:b/>
         </w:rPr>
-        <w:t>by Wednesday 26 March</w:t>
+        <w:t>complete and deliver all tasks assigned to Appolica by the end of tomorrow (Wednesday 26 March)</w:t>
       </w:r>
       <w:r>
-        <w:t>. With 79% of critical items already resolved, we are confident in meeting this deadline.</w:t>
+        <w:t xml:space="preserve"> for SDN testing. With 79% of critical items already resolved, we are confident in meeting this deadline.</w:t>
       </w:r>
     </w:p>
     <w:p>
       <w:r>
-        <w:t>The go-live date continues to depend on the SDN team's ability to provide the outstanding content, copy, and decisions for the remaining SDN-owned items. We are ready to implement these as soon as the required input is received.</w:t>
+        <w:t xml:space="preserve">To ensure alignment and timely progress towards Go Live, </w:t>
+      </w:r>
+      <w:r>
+        <w:rPr>
+          <w:b/>
+        </w:rPr>
+        <w:t>we need a confirmed timeline for the remaining items assigned to the SDN team</w:t>
+      </w:r>
+      <w:r>
+        <w:t>, particularly those related to outstanding content and feedback. It would be important to have this clarified as soon as possible to avoid any impact on the delivery plan.</w:t>
       </w:r>
     </w:p>
+    <w:p/>
     <w:p>
       <w:r>
         <w:rPr>
@@ -2533,7 +2562,7 @@
         <w:t xml:space="preserve">Appolica deliverables: </w:t>
       </w:r>
       <w:r>
-        <w:t>on track — 79% of critical items complete, remainder in progress.</w:t>
+        <w:t>on track — 79% of critical items complete, target: end of day Wednesday 26 March.</w:t>
       </w:r>
     </w:p>
     <w:p>
@@ -2547,7 +2576,7 @@
         <w:t xml:space="preserve">SDN deliverables: </w:t>
       </w:r>
       <w:r>
-        <w:t>blocking — timely input required to maintain go-live schedule.</w:t>
+        <w:t>blocking — confirmed timeline needed from SDN team to avoid delivery impact.</w:t>
       </w:r>
     </w:p>
     <w:p>
@@ -2558,10 +2587,24 @@
         <w:rPr>
           <w:b/>
         </w:rPr>
-        <w:t xml:space="preserve">Item #58 (Corp/Academic flow): </w:t>
+        <w:t xml:space="preserve">Corp/Academic flow (Item #58): </w:t>
       </w:r>
       <w:r>
-        <w:t>must be deferred to Phase 2. Including it would delay launch by 6+ weeks.</w:t>
+        <w:t>resolved — current behaviour confirmed working. Additional flow deferred to Phase 2.</w:t>
+      </w:r>
+    </w:p>
+    <w:p>
+      <w:pPr>
+        <w:pStyle w:val="ListBullet"/>
+      </w:pPr>
+      <w:r>
+        <w:rPr>
+          <w:b/>
+        </w:rPr>
+        <w:t xml:space="preserve">Awards page: </w:t>
+      </w:r>
+      <w:r>
+        <w:t>"Coming soon" state agreed for Go Live — post-launch iteration planned.</w:t>
       </w:r>
     </w:p>
     <w:p>
@@ -2580,10 +2623,10 @@
         <w:rPr>
           <w:b/>
         </w:rPr>
-        <w:t>Complete remaining Appolica items by Wednesday 26 March</w:t>
+        <w:t>Complete all remaining Appolica items by end of day Wednesday 26 March</w:t>
       </w:r>
       <w:r>
-        <w:t xml:space="preserve"> — final push on Membership, Touchpoint, and remaining areas.</w:t>
+        <w:t xml:space="preserve"> — final push on Membership, Touchpoint, and remaining areas — ready for SDN testing.</w:t>
       </w:r>
     </w:p>
     <w:p>
@@ -2608,10 +2651,10 @@
         <w:rPr>
           <w:b/>
         </w:rPr>
-        <w:t>Defer Corporate &amp; Academic flow redesign to Phase 2</w:t>
+        <w:t>Implement "Coming soon" state for Awards page</w:t>
       </w:r>
       <w:r>
-        <w:t xml:space="preserve"> — position unchanged from previous report.</w:t>
+        <w:t xml:space="preserve"> — as agreed in today's meeting.</w:t>
       </w:r>
     </w:p>
     <w:p>
@@ -2622,10 +2665,10 @@
         <w:rPr>
           <w:b/>
         </w:rPr>
-        <w:t>Request SDN input on remaining blocked items</w:t>
+        <w:t>Await confirmed timeline from SDN team</w:t>
       </w:r>
       <w:r>
-        <w:t xml:space="preserve"> — we are ready to implement immediately upon receiving content and decisions.</w:t>
+        <w:t xml:space="preserve"> — for remaining content, copy, and feedback items — critical to maintaining the Go Live schedule.</w:t>
       </w:r>
     </w:p>
     <w:p/>
@@ -2635,7 +2678,7 @@
         <w:rPr>
           <w:i/>
         </w:rPr>
-        <w:t>Should you have any questions or require further detail on any specific item, please do not hesitate to reach out.</w:t>
+        <w:t>Should you have any questions or require further detail on any specific item, please do not hesitate to reach out. A detailed breakdown by feature area is available in the accompanying Excel report.</w:t>
       </w:r>
     </w:p>
     <w:p/>

</xml_diff>